<commit_message>
✨ feat(CHANGELOG.md): 新增markdown-html-recognition.lua和markdown-to-docx.lua - 新增`markdown-html-recognition.lua`，解决pandoc不支持解析markdown中的html标签的问题，比如`<sub>`、`<sup>`、`<img>`等 - 新增`markdown-to-docx.lua`，统一调用`markdown-html-recognition.lua`和`image-title-to-caption.lua`
</commit_message>
<xml_diff>
--- a/templates_标题不编号 -列表第二行顶格_可设置代码块高亮样式.docx
+++ b/templates_标题不编号 -列表第二行顶格_可设置代码块高亮样式.docx
@@ -4130,12 +4130,12 @@
     <w:name w:val="Verbatim Char"/>
     <w:basedOn w:val="ac"/>
     <w:link w:val="SourceCode"/>
-    <w:rsid w:val="00E44B39"/>
+    <w:rsid w:val="00977B74"/>
     <w:rPr>
       <w:rFonts w:ascii="Fira Code" w:eastAsia="宋体" w:hAnsi="Fira Code" w:cs="Times New Roman (正文 CS 字体)"/>
       <w:color w:val="404040" w:themeColor="text1" w:themeTint="BF"/>
       <w:sz w:val="21"/>
-      <w:shd w:val="clear" w:color="F3F4F4" w:fill="auto"/>
+      <w:shd w:val="solid" w:color="F3F4F4" w:fill="F2F2F2" w:themeFill="background1" w:themeFillShade="F2"/>
       <w:lang w:eastAsia="zh-CN"/>
     </w:rPr>
   </w:style>
@@ -4178,7 +4178,7 @@
     <w:basedOn w:val="a"/>
     <w:link w:val="VerbatimChar"/>
     <w:qFormat/>
-    <w:rsid w:val="00E44B39"/>
+    <w:rsid w:val="00977B74"/>
     <w:pPr>
       <w:pBdr>
         <w:top w:val="single" w:sz="8" w:space="10" w:color="BFBFBF" w:themeColor="background1" w:themeShade="BF"/>
@@ -4186,7 +4186,7 @@
         <w:bottom w:val="single" w:sz="8" w:space="10" w:color="BFBFBF" w:themeColor="background1" w:themeShade="BF"/>
         <w:right w:val="single" w:sz="8" w:space="10" w:color="BFBFBF" w:themeColor="background1" w:themeShade="BF"/>
       </w:pBdr>
-      <w:shd w:val="clear" w:color="F3F4F4" w:fill="auto"/>
+      <w:shd w:val="solid" w:color="F3F4F4" w:fill="F2F2F2" w:themeFill="background1" w:themeFillShade="F2"/>
       <w:wordWrap w:val="0"/>
       <w:ind w:leftChars="300" w:left="300"/>
     </w:pPr>

</xml_diff>